<commit_message>
Level 1 schedule: every Saturday for 8 weeks
Co-Authored-By: Claude Opus 5.5 <noreply@anthropic.com>
</commit_message>
<xml_diff>
--- a/en/files/assignments/Presentation_Guide.docx
+++ b/en/files/assignments/Presentation_Guide.docx
@@ -43,7 +43,7 @@
         <w:t>When:</w:t>
       </w:r>
       <w:r>
-        <w:t xml:space="preserve"> Session 8 (weekend 4, Sunday), the 45-minute presentation block after "Be the reviewer"</w:t>
+        <w:t xml:space="preserve"> Session 8 (Week 8, Saturday), the 45-minute presentation block after "Be the reviewer"</w:t>
       </w:r>
     </w:p>
     <w:p>
@@ -1544,7 +1544,7 @@
         <w:pStyle w:val="ListBullet"/>
       </w:pPr>
       <w:r>
-        <w:t xml:space="preserve">Send the file to the course lead the evening before Session 8 (see </w:t>
+        <w:t xml:space="preserve">Send the file to the course lead the day before Session 8 (see </w:t>
       </w:r>
       <w:r>
         <w:rPr>

</xml_diff>